<commit_message>
Add new files and refactor Sudoku solving algorithms; update variable handling and improve consistency checks
</commit_message>
<xml_diff>
--- a/doc.docx
+++ b/doc.docx
@@ -9,7 +9,7 @@
       <w:r>
         <w:rPr/>
         <w:drawing>
-          <wp:anchor allowOverlap="1" behindDoc="1" distB="114300" distT="114300" distL="114300" distR="114300" hidden="0" layoutInCell="1" locked="0" relativeHeight="0" simplePos="0">
+          <wp:anchor allowOverlap="1" behindDoc="1" distB="0" distT="0" distL="0" distR="0" hidden="0" layoutInCell="1" locked="0" relativeHeight="0" simplePos="0">
             <wp:simplePos x="0" y="0"/>
             <wp:positionH relativeFrom="page">
               <wp:posOffset>0</wp:posOffset>
@@ -20,7 +20,7 @@
             <wp:extent cx="7570177" cy="10710863"/>
             <wp:effectExtent b="0" l="0" r="0" t="0"/>
             <wp:wrapNone/>
-            <wp:docPr id="1" name="image1.png"/>
+            <wp:docPr id="2" name="image1.png"/>
             <a:graphic>
               <a:graphicData uri="http://schemas.openxmlformats.org/drawingml/2006/picture">
                 <pic:pic>
@@ -30,7 +30,7 @@
                   </pic:nvPicPr>
                   <pic:blipFill>
                     <a:blip r:embed="rId7"/>
-                    <a:srcRect b="0" l="15" r="15" t="0"/>
+                    <a:srcRect b="0" l="15" r="14" t="0"/>
                     <a:stretch>
                       <a:fillRect/>
                     </a:stretch>
@@ -60,7 +60,7 @@
     </w:p>
     <w:sdt>
       <w:sdtPr>
-        <w:id w:val="-803042965"/>
+        <w:id w:val="513598368"/>
         <w:docPartObj>
           <w:docPartGallery w:val="Table of Contents"/>
           <w:docPartUnique w:val="1"/>
@@ -75,9 +75,17 @@
             </w:tabs>
             <w:spacing w:after="0" w:before="60" w:line="240" w:lineRule="auto"/>
             <w:rPr>
+              <w:rFonts w:ascii="Arial" w:cs="Arial" w:eastAsia="Arial" w:hAnsi="Arial"/>
               <w:b w:val="1"/>
+              <w:i w:val="0"/>
+              <w:smallCaps w:val="0"/>
+              <w:strike w:val="0"/>
               <w:color w:val="000000"/>
+              <w:sz w:val="22"/>
+              <w:szCs w:val="22"/>
               <w:u w:val="none"/>
+              <w:shd w:fill="auto" w:val="clear"/>
+              <w:vertAlign w:val="baseline"/>
             </w:rPr>
           </w:pPr>
           <w:r>
@@ -88,9 +96,17 @@
           <w:hyperlink w:anchor="_heading=h.7ypsm8gbvgt0">
             <w:r>
               <w:rPr>
+                <w:rFonts w:ascii="Calibri" w:cs="Calibri" w:eastAsia="Calibri" w:hAnsi="Calibri"/>
                 <w:b w:val="1"/>
+                <w:i w:val="0"/>
+                <w:smallCaps w:val="0"/>
+                <w:strike w:val="0"/>
                 <w:color w:val="000000"/>
+                <w:sz w:val="22"/>
+                <w:szCs w:val="22"/>
                 <w:u w:val="none"/>
+                <w:shd w:fill="auto" w:val="clear"/>
+                <w:vertAlign w:val="baseline"/>
                 <w:rtl w:val="0"/>
               </w:rPr>
               <w:t xml:space="preserve">Introducción</w:t>
@@ -112,20 +128,36 @@
             </w:tabs>
             <w:spacing w:after="0" w:before="60" w:line="240" w:lineRule="auto"/>
             <w:rPr>
+              <w:rFonts w:ascii="Arial" w:cs="Arial" w:eastAsia="Arial" w:hAnsi="Arial"/>
               <w:b w:val="1"/>
+              <w:i w:val="0"/>
+              <w:smallCaps w:val="0"/>
+              <w:strike w:val="0"/>
               <w:color w:val="000000"/>
+              <w:sz w:val="22"/>
+              <w:szCs w:val="22"/>
               <w:u w:val="none"/>
+              <w:shd w:fill="auto" w:val="clear"/>
+              <w:vertAlign w:val="baseline"/>
             </w:rPr>
           </w:pPr>
-          <w:hyperlink w:anchor="_heading=h.ll0vcpq79p9j">
+          <w:hyperlink w:anchor="_heading=h.635b3bdccody">
             <w:r>
               <w:rPr>
+                <w:rFonts w:ascii="Arial" w:cs="Arial" w:eastAsia="Arial" w:hAnsi="Arial"/>
                 <w:b w:val="1"/>
+                <w:i w:val="0"/>
+                <w:smallCaps w:val="0"/>
+                <w:strike w:val="0"/>
                 <w:color w:val="000000"/>
+                <w:sz w:val="22"/>
+                <w:szCs w:val="22"/>
                 <w:u w:val="none"/>
+                <w:shd w:fill="auto" w:val="clear"/>
+                <w:vertAlign w:val="baseline"/>
                 <w:rtl w:val="0"/>
               </w:rPr>
-              <w:t xml:space="preserve">Back Tracking</w:t>
+              <w:t xml:space="preserve">Explicación de la clase Variable</w:t>
               <w:tab/>
               <w:t xml:space="preserve">4</w:t>
             </w:r>
@@ -144,22 +176,470 @@
             </w:tabs>
             <w:spacing w:after="0" w:before="60" w:line="240" w:lineRule="auto"/>
             <w:rPr>
+              <w:rFonts w:ascii="Arial" w:cs="Arial" w:eastAsia="Arial" w:hAnsi="Arial"/>
               <w:b w:val="1"/>
+              <w:i w:val="0"/>
+              <w:smallCaps w:val="0"/>
+              <w:strike w:val="0"/>
               <w:color w:val="000000"/>
+              <w:sz w:val="22"/>
+              <w:szCs w:val="22"/>
               <w:u w:val="none"/>
+              <w:shd w:fill="auto" w:val="clear"/>
+              <w:vertAlign w:val="baseline"/>
+            </w:rPr>
+          </w:pPr>
+          <w:hyperlink w:anchor="_heading=h.2mojsdskfwxh">
+            <w:r>
+              <w:rPr>
+                <w:rFonts w:ascii="Arial" w:cs="Arial" w:eastAsia="Arial" w:hAnsi="Arial"/>
+                <w:b w:val="1"/>
+                <w:i w:val="0"/>
+                <w:smallCaps w:val="0"/>
+                <w:strike w:val="0"/>
+                <w:color w:val="000000"/>
+                <w:sz w:val="22"/>
+                <w:szCs w:val="22"/>
+                <w:u w:val="none"/>
+                <w:shd w:fill="auto" w:val="clear"/>
+                <w:vertAlign w:val="baseline"/>
+                <w:rtl w:val="0"/>
+              </w:rPr>
+              <w:t xml:space="preserve">Explicación de cómo se han tratado las casillas con números fijos</w:t>
+              <w:tab/>
+              <w:t xml:space="preserve">5</w:t>
+            </w:r>
+          </w:hyperlink>
+          <w:r>
+            <w:rPr>
+              <w:rtl w:val="0"/>
+            </w:rPr>
+          </w:r>
+        </w:p>
+        <w:p>
+          <w:pPr>
+            <w:widowControl w:val="0"/>
+            <w:tabs>
+              <w:tab w:val="right" w:leader="dot" w:pos="12000"/>
+            </w:tabs>
+            <w:spacing w:after="0" w:before="60" w:line="240" w:lineRule="auto"/>
+            <w:rPr>
+              <w:rFonts w:ascii="Arial" w:cs="Arial" w:eastAsia="Arial" w:hAnsi="Arial"/>
+              <w:b w:val="1"/>
+              <w:i w:val="0"/>
+              <w:smallCaps w:val="0"/>
+              <w:strike w:val="0"/>
+              <w:color w:val="000000"/>
+              <w:sz w:val="22"/>
+              <w:szCs w:val="22"/>
+              <w:u w:val="none"/>
+              <w:shd w:fill="auto" w:val="clear"/>
+              <w:vertAlign w:val="baseline"/>
+            </w:rPr>
+          </w:pPr>
+          <w:hyperlink w:anchor="_heading=h.s5tjz5i922q6">
+            <w:r>
+              <w:rPr>
+                <w:rFonts w:ascii="Arial" w:cs="Arial" w:eastAsia="Arial" w:hAnsi="Arial"/>
+                <w:b w:val="1"/>
+                <w:i w:val="0"/>
+                <w:smallCaps w:val="0"/>
+                <w:strike w:val="0"/>
+                <w:color w:val="000000"/>
+                <w:sz w:val="22"/>
+                <w:szCs w:val="22"/>
+                <w:u w:val="none"/>
+                <w:shd w:fill="auto" w:val="clear"/>
+                <w:vertAlign w:val="baseline"/>
+                <w:rtl w:val="0"/>
+              </w:rPr>
+              <w:t xml:space="preserve">Especificación formal del problema. La especificación formal debe detallar la tupla</w:t>
+              <w:tab/>
+              <w:t xml:space="preserve">6</w:t>
+            </w:r>
+          </w:hyperlink>
+          <w:r>
+            <w:rPr>
+              <w:rtl w:val="0"/>
+            </w:rPr>
+          </w:r>
+        </w:p>
+        <w:p>
+          <w:pPr>
+            <w:widowControl w:val="0"/>
+            <w:tabs>
+              <w:tab w:val="right" w:leader="dot" w:pos="12000"/>
+            </w:tabs>
+            <w:spacing w:after="0" w:before="60" w:line="240" w:lineRule="auto"/>
+            <w:rPr>
+              <w:rFonts w:ascii="Arial" w:cs="Arial" w:eastAsia="Arial" w:hAnsi="Arial"/>
+              <w:b w:val="1"/>
+              <w:i w:val="0"/>
+              <w:smallCaps w:val="0"/>
+              <w:strike w:val="0"/>
+              <w:color w:val="000000"/>
+              <w:sz w:val="22"/>
+              <w:szCs w:val="22"/>
+              <w:u w:val="none"/>
+              <w:shd w:fill="auto" w:val="clear"/>
+              <w:vertAlign w:val="baseline"/>
+            </w:rPr>
+          </w:pPr>
+          <w:hyperlink w:anchor="_heading=h.oy372m6093v5">
+            <w:r>
+              <w:rPr>
+                <w:rFonts w:ascii="Arial" w:cs="Arial" w:eastAsia="Arial" w:hAnsi="Arial"/>
+                <w:b w:val="1"/>
+                <w:i w:val="0"/>
+                <w:smallCaps w:val="0"/>
+                <w:strike w:val="0"/>
+                <w:color w:val="000000"/>
+                <w:sz w:val="22"/>
+                <w:szCs w:val="22"/>
+                <w:u w:val="none"/>
+                <w:shd w:fill="auto" w:val="clear"/>
+                <w:vertAlign w:val="baseline"/>
+                <w:rtl w:val="0"/>
+              </w:rPr>
+              <w:t xml:space="preserve">Apartado de experimentación en la que se describan las diferentes pruebas realizadas a los algoritmos, dejando bien claro el objetivo de las pruebas: plantillas con muchas celdas fijas, con pocas, etc</w:t>
+              <w:tab/>
+              <w:t xml:space="preserve">7</w:t>
+            </w:r>
+          </w:hyperlink>
+          <w:r>
+            <w:rPr>
+              <w:rtl w:val="0"/>
+            </w:rPr>
+          </w:r>
+        </w:p>
+        <w:p>
+          <w:pPr>
+            <w:widowControl w:val="0"/>
+            <w:tabs>
+              <w:tab w:val="right" w:leader="dot" w:pos="12000"/>
+            </w:tabs>
+            <w:spacing w:after="0" w:before="60" w:line="240" w:lineRule="auto"/>
+            <w:rPr>
+              <w:rFonts w:ascii="Arial" w:cs="Arial" w:eastAsia="Arial" w:hAnsi="Arial"/>
+              <w:b w:val="1"/>
+              <w:i w:val="0"/>
+              <w:smallCaps w:val="0"/>
+              <w:strike w:val="0"/>
+              <w:color w:val="000000"/>
+              <w:sz w:val="22"/>
+              <w:szCs w:val="22"/>
+              <w:u w:val="none"/>
+              <w:shd w:fill="auto" w:val="clear"/>
+              <w:vertAlign w:val="baseline"/>
+            </w:rPr>
+          </w:pPr>
+          <w:hyperlink w:anchor="_heading=h.hb2phs3ofwcm">
+            <w:r>
+              <w:rPr>
+                <w:rFonts w:ascii="Arial" w:cs="Arial" w:eastAsia="Arial" w:hAnsi="Arial"/>
+                <w:b w:val="1"/>
+                <w:i w:val="0"/>
+                <w:smallCaps w:val="0"/>
+                <w:strike w:val="0"/>
+                <w:color w:val="000000"/>
+                <w:sz w:val="22"/>
+                <w:szCs w:val="22"/>
+                <w:u w:val="none"/>
+                <w:shd w:fill="auto" w:val="clear"/>
+                <w:vertAlign w:val="baseline"/>
+                <w:rtl w:val="0"/>
+              </w:rPr>
+              <w:t xml:space="preserve">Estudio de tiempos. Determinar si la aplicación de AC3 reduce los tiempos de ejecución de los otros algoritmos con distintos sudokus</w:t>
+              <w:tab/>
+              <w:t xml:space="preserve">8</w:t>
+            </w:r>
+          </w:hyperlink>
+          <w:r>
+            <w:rPr>
+              <w:rtl w:val="0"/>
+            </w:rPr>
+          </w:r>
+        </w:p>
+        <w:p>
+          <w:pPr>
+            <w:widowControl w:val="0"/>
+            <w:tabs>
+              <w:tab w:val="right" w:leader="dot" w:pos="12000"/>
+            </w:tabs>
+            <w:spacing w:after="0" w:before="60" w:line="240" w:lineRule="auto"/>
+            <w:rPr>
+              <w:rFonts w:ascii="Arial" w:cs="Arial" w:eastAsia="Arial" w:hAnsi="Arial"/>
+              <w:b w:val="1"/>
+              <w:i w:val="0"/>
+              <w:smallCaps w:val="0"/>
+              <w:strike w:val="0"/>
+              <w:color w:val="000000"/>
+              <w:sz w:val="22"/>
+              <w:szCs w:val="22"/>
+              <w:u w:val="none"/>
+              <w:shd w:fill="auto" w:val="clear"/>
+              <w:vertAlign w:val="baseline"/>
+            </w:rPr>
+          </w:pPr>
+          <w:hyperlink w:anchor="_heading=h.jgkhweq9c540">
+            <w:r>
+              <w:rPr>
+                <w:rFonts w:ascii="Arial" w:cs="Arial" w:eastAsia="Arial" w:hAnsi="Arial"/>
+                <w:b w:val="1"/>
+                <w:i w:val="0"/>
+                <w:smallCaps w:val="0"/>
+                <w:strike w:val="0"/>
+                <w:color w:val="000000"/>
+                <w:sz w:val="22"/>
+                <w:szCs w:val="22"/>
+                <w:u w:val="none"/>
+                <w:shd w:fill="auto" w:val="clear"/>
+                <w:vertAlign w:val="baseline"/>
+                <w:rtl w:val="0"/>
+              </w:rPr>
+              <w:t xml:space="preserve">Utilización de gráficas para el análisis de tiempos.</w:t>
+              <w:tab/>
+              <w:t xml:space="preserve">9</w:t>
+            </w:r>
+          </w:hyperlink>
+          <w:r>
+            <w:rPr>
+              <w:rtl w:val="0"/>
+            </w:rPr>
+          </w:r>
+        </w:p>
+        <w:p>
+          <w:pPr>
+            <w:widowControl w:val="0"/>
+            <w:tabs>
+              <w:tab w:val="right" w:leader="dot" w:pos="12000"/>
+            </w:tabs>
+            <w:spacing w:after="0" w:before="60" w:line="240" w:lineRule="auto"/>
+            <w:rPr>
+              <w:rFonts w:ascii="Arial" w:cs="Arial" w:eastAsia="Arial" w:hAnsi="Arial"/>
+              <w:b w:val="1"/>
+              <w:i w:val="0"/>
+              <w:smallCaps w:val="0"/>
+              <w:strike w:val="0"/>
+              <w:color w:val="000000"/>
+              <w:sz w:val="22"/>
+              <w:szCs w:val="22"/>
+              <w:u w:val="none"/>
+              <w:shd w:fill="auto" w:val="clear"/>
+              <w:vertAlign w:val="baseline"/>
+            </w:rPr>
+          </w:pPr>
+          <w:hyperlink w:anchor="_heading=h.jtnjyjtb58ob">
+            <w:r>
+              <w:rPr>
+                <w:rFonts w:ascii="Arial" w:cs="Arial" w:eastAsia="Arial" w:hAnsi="Arial"/>
+                <w:b w:val="1"/>
+                <w:i w:val="0"/>
+                <w:smallCaps w:val="0"/>
+                <w:strike w:val="0"/>
+                <w:color w:val="000000"/>
+                <w:sz w:val="22"/>
+                <w:szCs w:val="22"/>
+                <w:u w:val="none"/>
+                <w:shd w:fill="auto" w:val="clear"/>
+                <w:vertAlign w:val="baseline"/>
+                <w:rtl w:val="0"/>
+              </w:rPr>
+              <w:t xml:space="preserve">Dificultades encontradas</w:t>
+              <w:tab/>
+              <w:t xml:space="preserve">10</w:t>
+            </w:r>
+          </w:hyperlink>
+          <w:r>
+            <w:rPr>
+              <w:rtl w:val="0"/>
+            </w:rPr>
+          </w:r>
+        </w:p>
+        <w:p>
+          <w:pPr>
+            <w:widowControl w:val="0"/>
+            <w:tabs>
+              <w:tab w:val="right" w:leader="dot" w:pos="12000"/>
+            </w:tabs>
+            <w:spacing w:after="0" w:before="60" w:line="240" w:lineRule="auto"/>
+            <w:rPr>
+              <w:rFonts w:ascii="Arial" w:cs="Arial" w:eastAsia="Arial" w:hAnsi="Arial"/>
+              <w:b w:val="1"/>
+              <w:i w:val="0"/>
+              <w:smallCaps w:val="0"/>
+              <w:strike w:val="0"/>
+              <w:color w:val="000000"/>
+              <w:sz w:val="22"/>
+              <w:szCs w:val="22"/>
+              <w:u w:val="none"/>
+              <w:shd w:fill="auto" w:val="clear"/>
+              <w:vertAlign w:val="baseline"/>
+            </w:rPr>
+          </w:pPr>
+          <w:hyperlink w:anchor="_heading=h.1rjwv998t4k6">
+            <w:r>
+              <w:rPr>
+                <w:rFonts w:ascii="Arial" w:cs="Arial" w:eastAsia="Arial" w:hAnsi="Arial"/>
+                <w:b w:val="1"/>
+                <w:i w:val="0"/>
+                <w:smallCaps w:val="0"/>
+                <w:strike w:val="0"/>
+                <w:color w:val="000000"/>
+                <w:sz w:val="22"/>
+                <w:szCs w:val="22"/>
+                <w:u w:val="none"/>
+                <w:shd w:fill="auto" w:val="clear"/>
+                <w:vertAlign w:val="baseline"/>
+                <w:rtl w:val="0"/>
+              </w:rPr>
+              <w:t xml:space="preserve">Uso de IAs generativas: explicación del uso que se ha hecho de ellas</w:t>
+              <w:tab/>
+              <w:t xml:space="preserve">11</w:t>
+            </w:r>
+          </w:hyperlink>
+          <w:r>
+            <w:rPr>
+              <w:rtl w:val="0"/>
+            </w:rPr>
+          </w:r>
+        </w:p>
+        <w:p>
+          <w:pPr>
+            <w:widowControl w:val="0"/>
+            <w:tabs>
+              <w:tab w:val="right" w:leader="dot" w:pos="12000"/>
+            </w:tabs>
+            <w:spacing w:after="0" w:before="60" w:line="240" w:lineRule="auto"/>
+            <w:rPr>
+              <w:rFonts w:ascii="Arial" w:cs="Arial" w:eastAsia="Arial" w:hAnsi="Arial"/>
+              <w:b w:val="1"/>
+              <w:i w:val="0"/>
+              <w:smallCaps w:val="0"/>
+              <w:strike w:val="0"/>
+              <w:color w:val="000000"/>
+              <w:sz w:val="22"/>
+              <w:szCs w:val="22"/>
+              <w:u w:val="none"/>
+              <w:shd w:fill="auto" w:val="clear"/>
+              <w:vertAlign w:val="baseline"/>
+            </w:rPr>
+          </w:pPr>
+          <w:hyperlink w:anchor="_heading=h.qvxtkr19tg75">
+            <w:r>
+              <w:rPr>
+                <w:rFonts w:ascii="Arial" w:cs="Arial" w:eastAsia="Arial" w:hAnsi="Arial"/>
+                <w:b w:val="1"/>
+                <w:i w:val="0"/>
+                <w:smallCaps w:val="0"/>
+                <w:strike w:val="0"/>
+                <w:color w:val="000000"/>
+                <w:sz w:val="22"/>
+                <w:szCs w:val="22"/>
+                <w:u w:val="none"/>
+                <w:shd w:fill="auto" w:val="clear"/>
+                <w:vertAlign w:val="baseline"/>
+                <w:rtl w:val="0"/>
+              </w:rPr>
+              <w:t xml:space="preserve">Apartado de referencias bibliográficas</w:t>
+              <w:tab/>
+              <w:t xml:space="preserve">12</w:t>
+            </w:r>
+          </w:hyperlink>
+          <w:r>
+            <w:rPr>
+              <w:rtl w:val="0"/>
+            </w:rPr>
+          </w:r>
+        </w:p>
+        <w:p>
+          <w:pPr>
+            <w:widowControl w:val="0"/>
+            <w:tabs>
+              <w:tab w:val="right" w:leader="dot" w:pos="12000"/>
+            </w:tabs>
+            <w:spacing w:after="0" w:before="60" w:line="240" w:lineRule="auto"/>
+            <w:rPr>
+              <w:rFonts w:ascii="Arial" w:cs="Arial" w:eastAsia="Arial" w:hAnsi="Arial"/>
+              <w:b w:val="1"/>
+              <w:i w:val="0"/>
+              <w:smallCaps w:val="0"/>
+              <w:strike w:val="0"/>
+              <w:color w:val="000000"/>
+              <w:sz w:val="22"/>
+              <w:szCs w:val="22"/>
+              <w:u w:val="none"/>
+              <w:shd w:fill="auto" w:val="clear"/>
+              <w:vertAlign w:val="baseline"/>
+            </w:rPr>
+          </w:pPr>
+          <w:hyperlink w:anchor="_heading=h.ll0vcpq79p9j">
+            <w:r>
+              <w:rPr>
+                <w:rFonts w:ascii="Calibri" w:cs="Calibri" w:eastAsia="Calibri" w:hAnsi="Calibri"/>
+                <w:b w:val="1"/>
+                <w:i w:val="0"/>
+                <w:smallCaps w:val="0"/>
+                <w:strike w:val="0"/>
+                <w:color w:val="000000"/>
+                <w:sz w:val="22"/>
+                <w:szCs w:val="22"/>
+                <w:u w:val="none"/>
+                <w:shd w:fill="auto" w:val="clear"/>
+                <w:vertAlign w:val="baseline"/>
+                <w:rtl w:val="0"/>
+              </w:rPr>
+              <w:t xml:space="preserve">Back Tracking</w:t>
+              <w:tab/>
+              <w:t xml:space="preserve">13</w:t>
+            </w:r>
+          </w:hyperlink>
+          <w:r>
+            <w:rPr>
+              <w:rtl w:val="0"/>
+            </w:rPr>
+          </w:r>
+        </w:p>
+        <w:p>
+          <w:pPr>
+            <w:widowControl w:val="0"/>
+            <w:tabs>
+              <w:tab w:val="right" w:leader="dot" w:pos="12000"/>
+            </w:tabs>
+            <w:spacing w:after="0" w:before="60" w:line="240" w:lineRule="auto"/>
+            <w:rPr>
+              <w:rFonts w:ascii="Arial" w:cs="Arial" w:eastAsia="Arial" w:hAnsi="Arial"/>
+              <w:b w:val="1"/>
+              <w:i w:val="0"/>
+              <w:smallCaps w:val="0"/>
+              <w:strike w:val="0"/>
+              <w:color w:val="000000"/>
+              <w:sz w:val="22"/>
+              <w:szCs w:val="22"/>
+              <w:u w:val="none"/>
+              <w:shd w:fill="auto" w:val="clear"/>
+              <w:vertAlign w:val="baseline"/>
             </w:rPr>
           </w:pPr>
           <w:hyperlink w:anchor="_heading=h.hc70oh97cxh6">
             <w:r>
               <w:rPr>
+                <w:rFonts w:ascii="Calibri" w:cs="Calibri" w:eastAsia="Calibri" w:hAnsi="Calibri"/>
                 <w:b w:val="1"/>
+                <w:i w:val="0"/>
+                <w:smallCaps w:val="0"/>
+                <w:strike w:val="0"/>
                 <w:color w:val="000000"/>
+                <w:sz w:val="22"/>
+                <w:szCs w:val="22"/>
                 <w:u w:val="none"/>
+                <w:shd w:fill="auto" w:val="clear"/>
+                <w:vertAlign w:val="baseline"/>
                 <w:rtl w:val="0"/>
               </w:rPr>
               <w:t xml:space="preserve">Forward Checking</w:t>
               <w:tab/>
-              <w:t xml:space="preserve">5</w:t>
+              <w:t xml:space="preserve">14</w:t>
             </w:r>
           </w:hyperlink>
           <w:r>
@@ -199,9 +679,7 @@
     <w:p>
       <w:pPr>
         <w:pStyle w:val="Heading2"/>
-        <w:rPr>
-          <w:rFonts w:ascii="Nunito" w:cs="Nunito" w:eastAsia="Nunito" w:hAnsi="Nunito"/>
-        </w:rPr>
+        <w:rPr/>
       </w:pPr>
       <w:bookmarkStart w:colFirst="0" w:colLast="0" w:name="_heading=h.7ypsm8gbvgt0" w:id="0"/>
       <w:bookmarkEnd w:id="0"/>
@@ -212,9 +690,263 @@
         <w:t xml:space="preserve">Introducción</w:t>
       </w:r>
       <w:r>
-        <w:rPr>
-          <w:rtl w:val="0"/>
-        </w:rPr>
+        <w:br w:type="page"/>
+      </w:r>
+      <w:r>
+        <w:rPr>
+          <w:rtl w:val="0"/>
+        </w:rPr>
+      </w:r>
+    </w:p>
+    <w:p>
+      <w:pPr>
+        <w:pStyle w:val="Heading2"/>
+        <w:rPr/>
+      </w:pPr>
+      <w:bookmarkStart w:colFirst="0" w:colLast="0" w:name="_heading=h.635b3bdccody" w:id="1"/>
+      <w:bookmarkEnd w:id="1"/>
+      <w:r>
+        <w:rPr>
+          <w:rtl w:val="0"/>
+        </w:rPr>
+        <w:t xml:space="preserve">Explicación de la clase Variable </w:t>
+      </w:r>
+    </w:p>
+    <w:p>
+      <w:pPr>
+        <w:rPr/>
+      </w:pPr>
+      <w:r>
+        <w:br w:type="page"/>
+      </w:r>
+      <w:r>
+        <w:rPr>
+          <w:rtl w:val="0"/>
+        </w:rPr>
+      </w:r>
+    </w:p>
+    <w:p>
+      <w:pPr>
+        <w:pStyle w:val="Heading2"/>
+        <w:rPr/>
+      </w:pPr>
+      <w:bookmarkStart w:colFirst="0" w:colLast="0" w:name="_heading=h.2mojsdskfwxh" w:id="2"/>
+      <w:bookmarkEnd w:id="2"/>
+      <w:r>
+        <w:rPr>
+          <w:rtl w:val="0"/>
+        </w:rPr>
+        <w:t xml:space="preserve">Explicación de cómo se han tratado las casillas con números fijos</w:t>
+      </w:r>
+    </w:p>
+    <w:p>
+      <w:pPr>
+        <w:pStyle w:val="Heading2"/>
+        <w:rPr/>
+      </w:pPr>
+      <w:bookmarkStart w:colFirst="0" w:colLast="0" w:name="_heading=h.n81irsr5b75n" w:id="3"/>
+      <w:bookmarkEnd w:id="3"/>
+      <w:r>
+        <w:br w:type="page"/>
+      </w:r>
+      <w:r>
+        <w:rPr>
+          <w:rtl w:val="0"/>
+        </w:rPr>
+      </w:r>
+    </w:p>
+    <w:p>
+      <w:pPr>
+        <w:pStyle w:val="Heading2"/>
+        <w:rPr/>
+      </w:pPr>
+      <w:bookmarkStart w:colFirst="0" w:colLast="0" w:name="_heading=h.s5tjz5i922q6" w:id="4"/>
+      <w:bookmarkEnd w:id="4"/>
+      <w:r>
+        <w:rPr>
+          <w:rtl w:val="0"/>
+        </w:rPr>
+        <w:t xml:space="preserve">Especificación formal del problema. La especificación formal debe detallar la tupla </w:t>
+      </w:r>
+    </w:p>
+    <w:p>
+      <w:pPr>
+        <w:pStyle w:val="Heading2"/>
+        <w:rPr/>
+      </w:pPr>
+      <w:bookmarkStart w:colFirst="0" w:colLast="0" w:name="_heading=h.cf8wg9nm15v3" w:id="5"/>
+      <w:bookmarkEnd w:id="5"/>
+      <w:r>
+        <w:br w:type="page"/>
+      </w:r>
+      <w:r>
+        <w:rPr>
+          <w:rtl w:val="0"/>
+        </w:rPr>
+      </w:r>
+    </w:p>
+    <w:p>
+      <w:pPr>
+        <w:pStyle w:val="Heading2"/>
+        <w:rPr/>
+      </w:pPr>
+      <w:bookmarkStart w:colFirst="0" w:colLast="0" w:name="_heading=h.oy372m6093v5" w:id="6"/>
+      <w:bookmarkEnd w:id="6"/>
+      <w:r>
+        <w:rPr>
+          <w:rtl w:val="0"/>
+        </w:rPr>
+        <w:t xml:space="preserve">Apartado de experimentación en la que se describan las diferentes pruebas realizadas a los algoritmos, dejando bien claro el objetivo de las pruebas: plantillas con muchas celdas fijas, con pocas, etc</w:t>
+      </w:r>
+    </w:p>
+    <w:p>
+      <w:pPr>
+        <w:pStyle w:val="Heading2"/>
+        <w:rPr/>
+      </w:pPr>
+      <w:bookmarkStart w:colFirst="0" w:colLast="0" w:name="_heading=h.t3nuzlp22rrw" w:id="7"/>
+      <w:bookmarkEnd w:id="7"/>
+      <w:r>
+        <w:br w:type="page"/>
+      </w:r>
+      <w:r>
+        <w:rPr>
+          <w:rtl w:val="0"/>
+        </w:rPr>
+      </w:r>
+    </w:p>
+    <w:p>
+      <w:pPr>
+        <w:pStyle w:val="Heading2"/>
+        <w:rPr/>
+      </w:pPr>
+      <w:bookmarkStart w:colFirst="0" w:colLast="0" w:name="_heading=h.hb2phs3ofwcm" w:id="8"/>
+      <w:bookmarkEnd w:id="8"/>
+      <w:r>
+        <w:rPr>
+          <w:rtl w:val="0"/>
+        </w:rPr>
+        <w:t xml:space="preserve">Estudio de tiempos. Determinar si la aplicación de AC3 reduce los tiempos de ejecución de los otros algoritmos con distintos sudokus</w:t>
+      </w:r>
+    </w:p>
+    <w:p>
+      <w:pPr>
+        <w:pStyle w:val="Heading2"/>
+        <w:rPr/>
+      </w:pPr>
+      <w:bookmarkStart w:colFirst="0" w:colLast="0" w:name="_heading=h.gyoeddlifwcl" w:id="9"/>
+      <w:bookmarkEnd w:id="9"/>
+      <w:r>
+        <w:br w:type="page"/>
+      </w:r>
+      <w:r>
+        <w:rPr>
+          <w:rtl w:val="0"/>
+        </w:rPr>
+      </w:r>
+    </w:p>
+    <w:p>
+      <w:pPr>
+        <w:pStyle w:val="Heading2"/>
+        <w:rPr/>
+      </w:pPr>
+      <w:bookmarkStart w:colFirst="0" w:colLast="0" w:name="_heading=h.jgkhweq9c540" w:id="10"/>
+      <w:bookmarkEnd w:id="10"/>
+      <w:r>
+        <w:rPr>
+          <w:rtl w:val="0"/>
+        </w:rPr>
+        <w:t xml:space="preserve">Utilización de gráficas para el análisis de tiempos. </w:t>
+      </w:r>
+    </w:p>
+    <w:p>
+      <w:pPr>
+        <w:pStyle w:val="Heading2"/>
+        <w:rPr/>
+      </w:pPr>
+      <w:bookmarkStart w:colFirst="0" w:colLast="0" w:name="_heading=h.tu9nakol93wf" w:id="11"/>
+      <w:bookmarkEnd w:id="11"/>
+      <w:r>
+        <w:br w:type="page"/>
+      </w:r>
+      <w:r>
+        <w:rPr>
+          <w:rtl w:val="0"/>
+        </w:rPr>
+      </w:r>
+    </w:p>
+    <w:p>
+      <w:pPr>
+        <w:pStyle w:val="Heading2"/>
+        <w:rPr/>
+      </w:pPr>
+      <w:bookmarkStart w:colFirst="0" w:colLast="0" w:name="_heading=h.jtnjyjtb58ob" w:id="12"/>
+      <w:bookmarkEnd w:id="12"/>
+      <w:r>
+        <w:rPr>
+          <w:rtl w:val="0"/>
+        </w:rPr>
+        <w:t xml:space="preserve">Dificultades encontradas</w:t>
+      </w:r>
+    </w:p>
+    <w:p>
+      <w:pPr>
+        <w:pStyle w:val="Heading2"/>
+        <w:rPr/>
+      </w:pPr>
+      <w:bookmarkStart w:colFirst="0" w:colLast="0" w:name="_heading=h.vr6xjlq7w689" w:id="13"/>
+      <w:bookmarkEnd w:id="13"/>
+      <w:r>
+        <w:br w:type="page"/>
+      </w:r>
+      <w:r>
+        <w:rPr>
+          <w:rtl w:val="0"/>
+        </w:rPr>
+      </w:r>
+    </w:p>
+    <w:p>
+      <w:pPr>
+        <w:pStyle w:val="Heading2"/>
+        <w:rPr/>
+      </w:pPr>
+      <w:bookmarkStart w:colFirst="0" w:colLast="0" w:name="_heading=h.1rjwv998t4k6" w:id="14"/>
+      <w:bookmarkEnd w:id="14"/>
+      <w:r>
+        <w:rPr>
+          <w:rtl w:val="0"/>
+        </w:rPr>
+        <w:t xml:space="preserve">Uso de IAs generativas: explicación del uso que se ha hecho de ellas</w:t>
+      </w:r>
+    </w:p>
+    <w:p>
+      <w:pPr>
+        <w:pStyle w:val="Heading2"/>
+        <w:rPr/>
+      </w:pPr>
+      <w:bookmarkStart w:colFirst="0" w:colLast="0" w:name="_heading=h.75n63k5mwsn5" w:id="15"/>
+      <w:bookmarkEnd w:id="15"/>
+      <w:r>
+        <w:br w:type="page"/>
+      </w:r>
+      <w:r>
+        <w:rPr>
+          <w:rtl w:val="0"/>
+        </w:rPr>
+      </w:r>
+    </w:p>
+    <w:p>
+      <w:pPr>
+        <w:pStyle w:val="Heading2"/>
+        <w:rPr/>
+      </w:pPr>
+      <w:bookmarkStart w:colFirst="0" w:colLast="0" w:name="_heading=h.qvxtkr19tg75" w:id="16"/>
+      <w:bookmarkEnd w:id="16"/>
+      <w:r>
+        <w:rPr>
+          <w:rtl w:val="0"/>
+        </w:rPr>
+        <w:t xml:space="preserve">Apartado de referencias bibliográficas</w:t>
       </w:r>
     </w:p>
     <w:p>
@@ -223,8 +955,8 @@
         <w:ind w:left="-1133.8582677165355" w:firstLine="0"/>
         <w:rPr/>
       </w:pPr>
-      <w:bookmarkStart w:colFirst="0" w:colLast="0" w:name="_heading=h.twlixyvb2qh8" w:id="1"/>
-      <w:bookmarkEnd w:id="1"/>
+      <w:bookmarkStart w:colFirst="0" w:colLast="0" w:name="_heading=h.twlixyvb2qh8" w:id="17"/>
+      <w:bookmarkEnd w:id="17"/>
       <w:r>
         <w:br w:type="page"/>
       </w:r>
@@ -239,8 +971,8 @@
         <w:pStyle w:val="Heading2"/>
         <w:rPr/>
       </w:pPr>
-      <w:bookmarkStart w:colFirst="0" w:colLast="0" w:name="_heading=h.ll0vcpq79p9j" w:id="2"/>
-      <w:bookmarkEnd w:id="2"/>
+      <w:bookmarkStart w:colFirst="0" w:colLast="0" w:name="_heading=h.ll0vcpq79p9j" w:id="18"/>
+      <w:bookmarkEnd w:id="18"/>
       <w:r>
         <w:rPr>
           <w:rtl w:val="0"/>
@@ -253,44 +985,44 @@
         <w:pStyle w:val="Heading2"/>
         <w:rPr/>
       </w:pPr>
-      <w:bookmarkStart w:colFirst="0" w:colLast="0" w:name="_heading=h.solfxgmr0g1w" w:id="3"/>
-      <w:bookmarkEnd w:id="3"/>
-      <w:r>
-        <w:rPr>
-          <w:rtl w:val="0"/>
-        </w:rPr>
-      </w:r>
-    </w:p>
-    <w:p>
-      <w:pPr>
-        <w:pStyle w:val="Heading2"/>
-        <w:rPr/>
-      </w:pPr>
-      <w:bookmarkStart w:colFirst="0" w:colLast="0" w:name="_heading=h.zh8w7tjm4bbb" w:id="4"/>
-      <w:bookmarkEnd w:id="4"/>
-      <w:r>
-        <w:rPr>
-          <w:rtl w:val="0"/>
-        </w:rPr>
-      </w:r>
-    </w:p>
-    <w:p>
-      <w:pPr>
-        <w:rPr/>
-      </w:pPr>
-      <w:r>
-        <w:rPr>
-          <w:rtl w:val="0"/>
-        </w:rPr>
-      </w:r>
-    </w:p>
-    <w:p>
-      <w:pPr>
-        <w:pStyle w:val="Heading2"/>
-        <w:rPr/>
-      </w:pPr>
-      <w:bookmarkStart w:colFirst="0" w:colLast="0" w:name="_heading=h.or5y1p5z08wu" w:id="5"/>
-      <w:bookmarkEnd w:id="5"/>
+      <w:bookmarkStart w:colFirst="0" w:colLast="0" w:name="_heading=h.solfxgmr0g1w" w:id="19"/>
+      <w:bookmarkEnd w:id="19"/>
+      <w:r>
+        <w:rPr>
+          <w:rtl w:val="0"/>
+        </w:rPr>
+      </w:r>
+    </w:p>
+    <w:p>
+      <w:pPr>
+        <w:pStyle w:val="Heading2"/>
+        <w:rPr/>
+      </w:pPr>
+      <w:bookmarkStart w:colFirst="0" w:colLast="0" w:name="_heading=h.zh8w7tjm4bbb" w:id="20"/>
+      <w:bookmarkEnd w:id="20"/>
+      <w:r>
+        <w:rPr>
+          <w:rtl w:val="0"/>
+        </w:rPr>
+      </w:r>
+    </w:p>
+    <w:p>
+      <w:pPr>
+        <w:rPr/>
+      </w:pPr>
+      <w:r>
+        <w:rPr>
+          <w:rtl w:val="0"/>
+        </w:rPr>
+      </w:r>
+    </w:p>
+    <w:p>
+      <w:pPr>
+        <w:pStyle w:val="Heading2"/>
+        <w:rPr/>
+      </w:pPr>
+      <w:bookmarkStart w:colFirst="0" w:colLast="0" w:name="_heading=h.or5y1p5z08wu" w:id="21"/>
+      <w:bookmarkEnd w:id="21"/>
       <w:r>
         <w:br w:type="page"/>
       </w:r>
@@ -305,8 +1037,8 @@
         <w:pStyle w:val="Heading2"/>
         <w:rPr/>
       </w:pPr>
-      <w:bookmarkStart w:colFirst="0" w:colLast="0" w:name="_heading=h.hc70oh97cxh6" w:id="6"/>
-      <w:bookmarkEnd w:id="6"/>
+      <w:bookmarkStart w:colFirst="0" w:colLast="0" w:name="_heading=h.hc70oh97cxh6" w:id="22"/>
+      <w:bookmarkEnd w:id="22"/>
       <w:r>
         <w:rPr>
           <w:rtl w:val="0"/>
@@ -459,6 +1191,20 @@
       <w:sz w:val="56"/>
       <w:szCs w:val="56"/>
     </w:rPr>
+  </w:style>
+  <w:style w:type="table" w:styleId="TableNormal" w:default="1">
+    <w:name w:val="TableNormal"/>
+    <w:tblPr>
+      <w:tblCellMar>
+        <w:top w:w="100.0" w:type="dxa"/>
+        <w:left w:w="100.0" w:type="dxa"/>
+        <w:bottom w:w="100.0" w:type="dxa"/>
+        <w:right w:w="100.0" w:type="dxa"/>
+      </w:tblCellMar>
+    </w:tblPr>
+  </w:style>
+  <w:style w:type="paragraph" w:styleId="Normal" w:default="1">
+    <w:name w:val="normal"/>
   </w:style>
   <w:style w:type="paragraph" w:styleId="Heading7">
     <w:name w:val="heading 7"/>
@@ -1112,7 +1858,7 @@
 
 <file path=customXML/item1.xml><?xml version="1.0" encoding="utf-8"?>
 <go:gDocsCustomXmlDataStorage xmlns:go="http://customooxmlschemas.google.com/" xmlns:r="http://schemas.openxmlformats.org/officeDocument/2006/relationships" uri="GoogleDocsCustomDataVersion2">
-  <go:docsCustomData xmlns:go="http://customooxmlschemas.google.com/" roundtripDataSignature="AMtx7mg9jslRU67h5LwBi+a5+PkNoWJ/Ng==">CgMxLjAyDmguN3lwc204Z2J2Z3QwMg5oLnR3bGl4eXZiMnFoODIOaC5sbDB2Y3BxNzlwOWoyDmguc29sZnhnbXIwZzF3Mg5oLnpoOHc3dGptNGJiYjIOaC5vcjV5MXA1ejA4d3UyDmguaGM3MG9oOTdjeGg2OABqIgoUc3VnZ2VzdC41MTJrZ2ZzeDUwbHASCllldiBUeXVyaW5qIQoTc3VnZ2VzdC40OXN5Zjl6MG8wMBIKWWV2IFR5dXJpbnIhMTRWUExvZDFQbjNKRGJZUzJOZnZfb2Q2cGhHZV82YUQt</go:docsCustomData>
+  <go:docsCustomData xmlns:go="http://customooxmlschemas.google.com/" roundtripDataSignature="AMtx7mhtwRPq3jqvNnw1SkDCiI67/5LcWQ==">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</go:docsCustomData>
 </go:gDocsCustomXmlDataStorage>
 </file>
 

</xml_diff>